<commit_message>
Update arm link dimensions to 400 and 300 mm
Co-authored-by: Copilot <223556219+Copilot@users.noreply.github.com>
</commit_message>
<xml_diff>
--- a/docs/DUM_E_4DOF_Tai_lieu_ky_thuat.docx
+++ b/docs/DUM_E_4DOF_Tai_lieu_ky_thuat.docx
@@ -130,7 +130,7 @@
                 <w:b w:val="0"/>
                 <w:sz w:val="18"/>
               </w:rPr>
-              <w:t>L0 = 100 mm; L1 = 500 mm; L2 = 400 mm; L3 = 80 mm; Lf = 150 mm (chiều dài cung ngón)</w:t>
+              <w:t>L0 = 100 mm; L1 = 400 mm; L2 = 300 mm; L3 = 80 mm; Lf = 150 mm (chiều dài cung ngón)</w:t>
             </w:r>
           </w:p>
         </w:tc>
@@ -1010,7 +1010,7 @@
                 <w:b w:val="0"/>
                 <w:sz w:val="18"/>
               </w:rPr>
-              <w:t>500 mm</w:t>
+              <w:t>400 mm</w:t>
             </w:r>
           </w:p>
         </w:tc>
@@ -1072,7 +1072,7 @@
                 <w:b w:val="0"/>
                 <w:sz w:val="18"/>
               </w:rPr>
-              <w:t>400 mm</w:t>
+              <w:t>300 mm</w:t>
             </w:r>
           </w:p>
         </w:tc>
@@ -1154,7 +1154,7 @@
                 <w:b w:val="0"/>
                 <w:sz w:val="18"/>
               </w:rPr>
-              <w:t>Chiều dài cổ tay đến điểm công tác quy ước</w:t>
+              <w:t>Chiều dài từ cổ tay đến giá kẹp (gripper mount)</w:t>
             </w:r>
           </w:p>
         </w:tc>
@@ -1227,7 +1227,7 @@
         <w:spacing w:after="80"/>
       </w:pPr>
       <w:r>
-        <w:t>Tầm với danh nghĩa đến tâm kẹp khi L1, L2, L3 thẳng hàng là L1 + L2 + L3 + l_g = 1104.05 mm tính từ tâm vai; l_g = 124.05 mm là độ sâu trục của ngón cong Lf = 150 mm (chiều dài cung, độ cong 60°). Đây là giới hạn hình học lý tưởng, không phải vùng làm việc an toàn; vùng thật còn phụ thuộc góc khớp, va chạm, tải, servo và kết cấu.</w:t>
+        <w:t>Tầm với danh nghĩa đến tâm kẹp khi L1, L2, L3 thẳng hàng là L1 + L2 + L3 + l_g = 904.05 mm tính từ tâm vai; l_g = 124.05 mm là độ sâu trục của ngón cong Lf = 150 mm (chiều dài cung, độ cong 60°). Đây là giới hạn hình học lý tưởng, không phải vùng làm việc an toàn; vùng thật còn phụ thuộc góc khớp, va chạm, tải, servo và kết cấu.</w:t>
       </w:r>
     </w:p>
     <w:p>
@@ -1621,7 +1621,7 @@
         <w:spacing w:after="80"/>
       </w:pPr>
       <w:r>
-        <w:t>Nếu q0 = 0°, q1 = 0°, q2 = 0°, q3 = 0° thì r = 500 + 400 + 80 + 124.05 = 1104.05 mm; x = 1104.05 mm, y = 0 mm, z = 100 mm. Đây là tư thế duỗi ngang hoàn toàn theo quy ước.</w:t>
+        <w:t>Nếu q0 = 0°, q1 = 0°, q2 = 0°, q3 = 0° thì r = 400 + 300 + 80 + 124.05 = 904.05 mm; x = 904.05 mm, y = 0 mm, z = 100 mm. Đây là tư thế duỗi ngang hoàn toàn theo quy ước.</w:t>
       </w:r>
     </w:p>
     <w:p>
@@ -1629,7 +1629,7 @@
         <w:spacing w:after="80"/>
       </w:pPr>
       <w:r>
-        <w:t>Nếu q1 = 90°, q2 = 0°, q3 = 0° thì các đoạn L1–L3 và độ sâu l_g hướng lên theo phương thẳng đứng, cho x = y = 0 và z = 100 + 1104.05 = 1204.05 mm (bỏ qua giới hạn cơ khí).</w:t>
+        <w:t>Nếu q1 = 90°, q2 = 0°, q3 = 0° thì các đoạn L1–L3 và độ sâu l_g hướng lên theo phương thẳng đứng, cho x = y = 0 và z = 100 + 904.05 = 1004.05 mm (bỏ qua giới hạn cơ khí).</w:t>
       </w:r>
     </w:p>
     <w:p>
@@ -3956,7 +3956,7 @@
           <w:color w:val="282828"/>
           <w:sz w:val="16"/>
         </w:rPr>
-        <w:t>L0, L1, L2, L3, Lf = 100.0, 500.0, 400.0, 80.0, 150.0  # mm
+        <w:t>L0, L1, L2, L3, Lf = 100.0, 400.0, 300.0, 80.0, 150.0  # mm
 FINGER_CURL = math.radians(60.0)
 GRIP_DEPTH = (Lf / FINGER_CURL) * math.sin(FINGER_CURL)</w:t>
       </w:r>

</xml_diff>